<commit_message>
Update README and research documents for improved clarity and structure
</commit_message>
<xml_diff>
--- a/Research/Overview/Understanding GPUs.docx
+++ b/Research/Overview/Understanding GPUs.docx
@@ -12,7 +12,7 @@
     </w:p>
     <w:p/>
     <w:p>
-      <w:hyperlink r:id="rId5" w:history="1">
+      <w:hyperlink r:id="rId7" w:history="1">
         <w:r>
           <w:rPr>
             <w:rStyle w:val="Hyperlink"/>
@@ -71,9 +71,12 @@
     </w:p>
     <w:p>
       <w:r>
+        <w:rPr>
+          <w:noProof/>
+        </w:rPr>
         <w:drawing>
-          <wp:inline distT="0" distB="0" distL="0" distR="0" wp14:anchorId="63C2B14F" wp14:editId="7AACCF1C">
-            <wp:extent cx="5943600" cy="3223260"/>
+          <wp:inline distT="0" distB="0" distL="0" distR="0" wp14:anchorId="63C2B14F" wp14:editId="0622CEF6">
+            <wp:extent cx="6466578" cy="3506875"/>
             <wp:effectExtent l="0" t="0" r="0" b="0"/>
             <wp:docPr id="1996744088" name="Picture 1"/>
             <wp:cNvGraphicFramePr>
@@ -87,7 +90,7 @@
                     <pic:cNvPicPr/>
                   </pic:nvPicPr>
                   <pic:blipFill>
-                    <a:blip r:embed="rId6"/>
+                    <a:blip r:embed="rId8"/>
                     <a:stretch>
                       <a:fillRect/>
                     </a:stretch>
@@ -95,7 +98,7 @@
                   <pic:spPr>
                     <a:xfrm>
                       <a:off x="0" y="0"/>
-                      <a:ext cx="5943600" cy="3223260"/>
+                      <a:ext cx="6482126" cy="3515307"/>
                     </a:xfrm>
                     <a:prstGeom prst="rect">
                       <a:avLst/>
@@ -109,6 +112,11 @@
       </w:r>
     </w:p>
     <w:p>
+      <w:r>
+        <w:br w:type="page"/>
+      </w:r>
+    </w:p>
+    <w:p>
       <w:pPr>
         <w:pStyle w:val="ListParagraph"/>
         <w:numPr>
@@ -117,6 +125,7 @@
         </w:numPr>
       </w:pPr>
       <w:r>
+        <w:lastRenderedPageBreak/>
         <w:t>Split across 3 different sources:</w:t>
       </w:r>
     </w:p>
@@ -136,6 +145,141 @@
       <w:pPr>
         <w:pStyle w:val="ListParagraph"/>
         <w:numPr>
+          <w:ilvl w:val="2"/>
+          <w:numId w:val="1"/>
+        </w:numPr>
+      </w:pPr>
+      <w:r>
+        <w:t>Very fast but small cache memory</w:t>
+      </w:r>
+    </w:p>
+    <w:p>
+      <w:pPr>
+        <w:pStyle w:val="ListParagraph"/>
+        <w:numPr>
+          <w:ilvl w:val="2"/>
+          <w:numId w:val="1"/>
+        </w:numPr>
+      </w:pPr>
+      <w:r>
+        <w:t>Located inside GPU, uses Registers, L1 Cache, and L2 Cache</w:t>
+      </w:r>
+    </w:p>
+    <w:p>
+      <w:pPr>
+        <w:pStyle w:val="ListParagraph"/>
+        <w:numPr>
+          <w:ilvl w:val="3"/>
+          <w:numId w:val="1"/>
+        </w:numPr>
+      </w:pPr>
+      <w:r>
+        <w:t>L1 Cache</w:t>
+      </w:r>
+    </w:p>
+    <w:p>
+      <w:pPr>
+        <w:pStyle w:val="ListParagraph"/>
+        <w:numPr>
+          <w:ilvl w:val="4"/>
+          <w:numId w:val="1"/>
+        </w:numPr>
+      </w:pPr>
+      <w:r>
+        <w:t>First level cache inside Streaming Multiprocessor (SM)</w:t>
+      </w:r>
+    </w:p>
+    <w:p>
+      <w:pPr>
+        <w:pStyle w:val="ListParagraph"/>
+        <w:numPr>
+          <w:ilvl w:val="4"/>
+          <w:numId w:val="1"/>
+        </w:numPr>
+      </w:pPr>
+      <w:r>
+        <w:t>Stores frequently accessed data to speed up calculations</w:t>
+      </w:r>
+    </w:p>
+    <w:p>
+      <w:pPr>
+        <w:pStyle w:val="ListParagraph"/>
+        <w:numPr>
+          <w:ilvl w:val="3"/>
+          <w:numId w:val="1"/>
+        </w:numPr>
+      </w:pPr>
+      <w:r>
+        <w:t>L2 Chache</w:t>
+      </w:r>
+    </w:p>
+    <w:p>
+      <w:pPr>
+        <w:pStyle w:val="ListParagraph"/>
+        <w:numPr>
+          <w:ilvl w:val="4"/>
+          <w:numId w:val="1"/>
+        </w:numPr>
+      </w:pPr>
+      <w:r>
+        <w:t>Larger, second level cache shared between multiple SMs</w:t>
+      </w:r>
+    </w:p>
+    <w:p>
+      <w:pPr>
+        <w:pStyle w:val="ListParagraph"/>
+        <w:numPr>
+          <w:ilvl w:val="4"/>
+          <w:numId w:val="1"/>
+        </w:numPr>
+      </w:pPr>
+      <w:r>
+        <w:t>Helps store and reuse data too big for L1 cache</w:t>
+      </w:r>
+    </w:p>
+    <w:p>
+      <w:pPr>
+        <w:pStyle w:val="ListParagraph"/>
+        <w:numPr>
+          <w:ilvl w:val="2"/>
+          <w:numId w:val="1"/>
+        </w:numPr>
+      </w:pPr>
+      <w:r>
+        <w:t>Caches reduce reliance on external memory (VRAM) and speed up calculations</w:t>
+      </w:r>
+    </w:p>
+    <w:p>
+      <w:pPr>
+        <w:pStyle w:val="ListParagraph"/>
+        <w:numPr>
+          <w:ilvl w:val="2"/>
+          <w:numId w:val="1"/>
+        </w:numPr>
+      </w:pPr>
+      <w:r>
+        <w:t>Optimizing how data is stored speeds up GPU processing</w:t>
+      </w:r>
+    </w:p>
+    <w:p>
+      <w:pPr>
+        <w:pStyle w:val="ListParagraph"/>
+        <w:numPr>
+          <w:ilvl w:val="2"/>
+          <w:numId w:val="1"/>
+        </w:numPr>
+      </w:pPr>
+      <w:r>
+        <w:t>M</w:t>
+      </w:r>
+      <w:r>
+        <w:t>ost important for getting the fundamentals of GPU processing working</w:t>
+      </w:r>
+    </w:p>
+    <w:p>
+      <w:pPr>
+        <w:pStyle w:val="ListParagraph"/>
+        <w:numPr>
           <w:ilvl w:val="1"/>
           <w:numId w:val="1"/>
         </w:numPr>
@@ -148,6 +292,45 @@
       <w:pPr>
         <w:pStyle w:val="ListParagraph"/>
         <w:numPr>
+          <w:ilvl w:val="2"/>
+          <w:numId w:val="1"/>
+        </w:numPr>
+      </w:pPr>
+      <w:r>
+        <w:t xml:space="preserve">Used in High Performance GPUs for </w:t>
+      </w:r>
+      <w:r>
+        <w:t>AI and deep learning workloads</w:t>
+      </w:r>
+    </w:p>
+    <w:p>
+      <w:pPr>
+        <w:pStyle w:val="ListParagraph"/>
+        <w:numPr>
+          <w:ilvl w:val="2"/>
+          <w:numId w:val="1"/>
+        </w:numPr>
+      </w:pPr>
+      <w:r>
+        <w:t>Stacks memory vertically</w:t>
+      </w:r>
+    </w:p>
+    <w:p>
+      <w:pPr>
+        <w:pStyle w:val="ListParagraph"/>
+        <w:numPr>
+          <w:ilvl w:val="2"/>
+          <w:numId w:val="1"/>
+        </w:numPr>
+      </w:pPr>
+      <w:r>
+        <w:t>Overall, lowest priority for a GPU of the scale envisioned</w:t>
+      </w:r>
+    </w:p>
+    <w:p>
+      <w:pPr>
+        <w:pStyle w:val="ListParagraph"/>
+        <w:numPr>
           <w:ilvl w:val="1"/>
           <w:numId w:val="1"/>
         </w:numPr>
@@ -155,6 +338,210 @@
       <w:r>
         <w:t>DRAM</w:t>
       </w:r>
+    </w:p>
+    <w:p>
+      <w:pPr>
+        <w:pStyle w:val="ListParagraph"/>
+        <w:numPr>
+          <w:ilvl w:val="2"/>
+          <w:numId w:val="1"/>
+        </w:numPr>
+      </w:pPr>
+      <w:r>
+        <w:t>Main memory</w:t>
+      </w:r>
+    </w:p>
+    <w:p>
+      <w:pPr>
+        <w:pStyle w:val="ListParagraph"/>
+        <w:numPr>
+          <w:ilvl w:val="2"/>
+          <w:numId w:val="1"/>
+        </w:numPr>
+      </w:pPr>
+      <w:r>
+        <w:t>Found on video card</w:t>
+      </w:r>
+    </w:p>
+    <w:p>
+      <w:pPr>
+        <w:pStyle w:val="ListParagraph"/>
+        <w:numPr>
+          <w:ilvl w:val="2"/>
+          <w:numId w:val="1"/>
+        </w:numPr>
+      </w:pPr>
+      <w:r>
+        <w:t>Stores large amounts of data</w:t>
+      </w:r>
+    </w:p>
+    <w:p>
+      <w:pPr>
+        <w:pStyle w:val="ListParagraph"/>
+        <w:numPr>
+          <w:ilvl w:val="2"/>
+          <w:numId w:val="1"/>
+        </w:numPr>
+      </w:pPr>
+      <w:r>
+        <w:t>Good to work on once main GPU is figured out</w:t>
+      </w:r>
+    </w:p>
+    <w:p>
+      <w:pPr>
+        <w:pStyle w:val="ListParagraph"/>
+        <w:numPr>
+          <w:ilvl w:val="0"/>
+          <w:numId w:val="1"/>
+        </w:numPr>
+      </w:pPr>
+      <w:r>
+        <w:t>Memory Transfer</w:t>
+      </w:r>
+    </w:p>
+    <w:p>
+      <w:pPr>
+        <w:pStyle w:val="ListParagraph"/>
+        <w:numPr>
+          <w:ilvl w:val="1"/>
+          <w:numId w:val="1"/>
+        </w:numPr>
+      </w:pPr>
+      <w:r>
+        <w:t>Computationally expensive to transfer data from DRAM to SRAM</w:t>
+      </w:r>
+    </w:p>
+    <w:p>
+      <w:pPr>
+        <w:pStyle w:val="ListParagraph"/>
+        <w:numPr>
+          <w:ilvl w:val="1"/>
+          <w:numId w:val="1"/>
+        </w:numPr>
+      </w:pPr>
+      <w:r>
+        <w:t>Optimizing efficient memory usage optimizes performance of tasks</w:t>
+      </w:r>
+    </w:p>
+    <w:p>
+      <w:r>
+        <w:br w:type="page"/>
+      </w:r>
+    </w:p>
+    <w:p>
+      <w:r>
+        <w:lastRenderedPageBreak/>
+        <w:t>Streaming Processors (SMs)</w:t>
+      </w:r>
+    </w:p>
+    <w:p>
+      <w:r>
+        <w:drawing>
+          <wp:inline distT="0" distB="0" distL="0" distR="0" wp14:anchorId="0167DE77" wp14:editId="17A99A72">
+            <wp:extent cx="5943600" cy="3197860"/>
+            <wp:effectExtent l="0" t="0" r="0" b="2540"/>
+            <wp:docPr id="323862092" name="Picture 1"/>
+            <wp:cNvGraphicFramePr>
+              <a:graphicFrameLocks xmlns:a="http://schemas.openxmlformats.org/drawingml/2006/main" noChangeAspect="1"/>
+            </wp:cNvGraphicFramePr>
+            <a:graphic xmlns:a="http://schemas.openxmlformats.org/drawingml/2006/main">
+              <a:graphicData uri="http://schemas.openxmlformats.org/drawingml/2006/picture">
+                <pic:pic xmlns:pic="http://schemas.openxmlformats.org/drawingml/2006/picture">
+                  <pic:nvPicPr>
+                    <pic:cNvPr id="323862092" name=""/>
+                    <pic:cNvPicPr/>
+                  </pic:nvPicPr>
+                  <pic:blipFill>
+                    <a:blip r:embed="rId9"/>
+                    <a:stretch>
+                      <a:fillRect/>
+                    </a:stretch>
+                  </pic:blipFill>
+                  <pic:spPr>
+                    <a:xfrm>
+                      <a:off x="0" y="0"/>
+                      <a:ext cx="5943600" cy="3197860"/>
+                    </a:xfrm>
+                    <a:prstGeom prst="rect">
+                      <a:avLst/>
+                    </a:prstGeom>
+                  </pic:spPr>
+                </pic:pic>
+              </a:graphicData>
+            </a:graphic>
+          </wp:inline>
+        </w:drawing>
+      </w:r>
+    </w:p>
+    <w:p/>
+    <w:p>
+      <w:pPr>
+        <w:pStyle w:val="ListParagraph"/>
+        <w:numPr>
+          <w:ilvl w:val="0"/>
+          <w:numId w:val="1"/>
+        </w:numPr>
+      </w:pPr>
+      <w:r>
+        <w:t>Fundamental Processing Unit of a GPU</w:t>
+      </w:r>
+    </w:p>
+    <w:p>
+      <w:pPr>
+        <w:pStyle w:val="ListParagraph"/>
+        <w:numPr>
+          <w:ilvl w:val="0"/>
+          <w:numId w:val="1"/>
+        </w:numPr>
+      </w:pPr>
+      <w:r>
+        <w:t>Each SM contains multiple GPU cores, a small memory pool (SRAM), and execution units</w:t>
+      </w:r>
+    </w:p>
+    <w:p>
+      <w:pPr>
+        <w:pStyle w:val="ListParagraph"/>
+        <w:numPr>
+          <w:ilvl w:val="0"/>
+          <w:numId w:val="1"/>
+        </w:numPr>
+      </w:pPr>
+      <w:r>
+        <w:t>Each SM operates independently</w:t>
+      </w:r>
+    </w:p>
+    <w:p>
+      <w:pPr>
+        <w:pStyle w:val="ListParagraph"/>
+        <w:numPr>
+          <w:ilvl w:val="0"/>
+          <w:numId w:val="1"/>
+        </w:numPr>
+      </w:pPr>
+      <w:r>
+        <w:t>GPU computational power directly tied to number of SMs</w:t>
+      </w:r>
+    </w:p>
+    <w:p>
+      <w:pPr>
+        <w:pStyle w:val="ListParagraph"/>
+        <w:numPr>
+          <w:ilvl w:val="0"/>
+          <w:numId w:val="1"/>
+        </w:numPr>
+      </w:pPr>
+      <w:r>
+        <w:t>Project should implement multiple SMs in parallel</w:t>
+      </w:r>
+    </w:p>
+    <w:p>
+      <w:pPr>
+        <w:pStyle w:val="ListParagraph"/>
+        <w:numPr>
+          <w:ilvl w:val="1"/>
+          <w:numId w:val="1"/>
+        </w:numPr>
+      </w:pPr>
     </w:p>
     <w:p>
       <w:pPr>
@@ -169,6 +556,56 @@
     </w:sectPr>
   </w:body>
 </w:document>
+</file>
+
+<file path=word/endnotes.xml><?xml version="1.0" encoding="utf-8"?>
+<w:endnotes xmlns:wpc="http://schemas.microsoft.com/office/word/2010/wordprocessingCanvas" xmlns:cx="http://schemas.microsoft.com/office/drawing/2014/chartex" xmlns:cx1="http://schemas.microsoft.com/office/drawing/2015/9/8/chartex" xmlns:cx2="http://schemas.microsoft.com/office/drawing/2015/10/21/chartex" xmlns:cx3="http://schemas.microsoft.com/office/drawing/2016/5/9/chartex" xmlns:cx4="http://schemas.microsoft.com/office/drawing/2016/5/10/chartex" xmlns:cx5="http://schemas.microsoft.com/office/drawing/2016/5/11/chartex" xmlns:cx6="http://schemas.microsoft.com/office/drawing/2016/5/12/chartex" xmlns:cx7="http://schemas.microsoft.com/office/drawing/2016/5/13/chartex" xmlns:cx8="http://schemas.microsoft.com/office/drawing/2016/5/14/chartex" xmlns:mc="http://schemas.openxmlformats.org/markup-compatibility/2006" xmlns:aink="http://schemas.microsoft.com/office/drawing/2016/ink" xmlns:am3d="http://schemas.microsoft.com/office/drawing/2017/model3d" xmlns:o="urn:schemas-microsoft-com:office:office" xmlns:oel="http://schemas.microsoft.com/office/2019/extlst" xmlns:r="http://schemas.openxmlformats.org/officeDocument/2006/relationships" xmlns:m="http://schemas.openxmlformats.org/officeDocument/2006/math" xmlns:v="urn:schemas-microsoft-com:vml" xmlns:wp14="http://schemas.microsoft.com/office/word/2010/wordprocessingDrawing" xmlns:wp="http://schemas.openxmlformats.org/drawingml/2006/wordprocessingDrawing" xmlns:w10="urn:schemas-microsoft-com:office:word" xmlns:w="http://schemas.openxmlformats.org/wordprocessingml/2006/main" xmlns:w14="http://schemas.microsoft.com/office/word/2010/wordml" xmlns:w15="http://schemas.microsoft.com/office/word/2012/wordml" xmlns:w16cex="http://schemas.microsoft.com/office/word/2018/wordml/cex" xmlns:w16cid="http://schemas.microsoft.com/office/word/2016/wordml/cid" xmlns:w16="http://schemas.microsoft.com/office/word/2018/wordml" xmlns:w16du="http://schemas.microsoft.com/office/word/2023/wordml/word16du" xmlns:w16sdtdh="http://schemas.microsoft.com/office/word/2020/wordml/sdtdatahash" xmlns:w16sdtfl="http://schemas.microsoft.com/office/word/2024/wordml/sdtformatlock" xmlns:w16se="http://schemas.microsoft.com/office/word/2015/wordml/symex" xmlns:wpg="http://schemas.microsoft.com/office/word/2010/wordprocessingGroup" xmlns:wpi="http://schemas.microsoft.com/office/word/2010/wordprocessingInk" xmlns:wne="http://schemas.microsoft.com/office/word/2006/wordml" xmlns:wps="http://schemas.microsoft.com/office/word/2010/wordprocessingShape" mc:Ignorable="w14 w15 w16se w16cid w16 w16cex w16sdtdh w16sdtfl w16du wp14">
+  <w:endnote w:type="separator" w:id="-1">
+    <w:p>
+      <w:pPr>
+        <w:spacing w:after="0" w:line="240" w:lineRule="auto"/>
+      </w:pPr>
+      <w:r>
+        <w:separator/>
+      </w:r>
+    </w:p>
+  </w:endnote>
+  <w:endnote w:type="continuationSeparator" w:id="0">
+    <w:p>
+      <w:pPr>
+        <w:spacing w:after="0" w:line="240" w:lineRule="auto"/>
+      </w:pPr>
+      <w:r>
+        <w:continuationSeparator/>
+      </w:r>
+    </w:p>
+  </w:endnote>
+</w:endnotes>
+</file>
+
+<file path=word/footnotes.xml><?xml version="1.0" encoding="utf-8"?>
+<w:footnotes xmlns:wpc="http://schemas.microsoft.com/office/word/2010/wordprocessingCanvas" xmlns:cx="http://schemas.microsoft.com/office/drawing/2014/chartex" xmlns:cx1="http://schemas.microsoft.com/office/drawing/2015/9/8/chartex" xmlns:cx2="http://schemas.microsoft.com/office/drawing/2015/10/21/chartex" xmlns:cx3="http://schemas.microsoft.com/office/drawing/2016/5/9/chartex" xmlns:cx4="http://schemas.microsoft.com/office/drawing/2016/5/10/chartex" xmlns:cx5="http://schemas.microsoft.com/office/drawing/2016/5/11/chartex" xmlns:cx6="http://schemas.microsoft.com/office/drawing/2016/5/12/chartex" xmlns:cx7="http://schemas.microsoft.com/office/drawing/2016/5/13/chartex" xmlns:cx8="http://schemas.microsoft.com/office/drawing/2016/5/14/chartex" xmlns:mc="http://schemas.openxmlformats.org/markup-compatibility/2006" xmlns:aink="http://schemas.microsoft.com/office/drawing/2016/ink" xmlns:am3d="http://schemas.microsoft.com/office/drawing/2017/model3d" xmlns:o="urn:schemas-microsoft-com:office:office" xmlns:oel="http://schemas.microsoft.com/office/2019/extlst" xmlns:r="http://schemas.openxmlformats.org/officeDocument/2006/relationships" xmlns:m="http://schemas.openxmlformats.org/officeDocument/2006/math" xmlns:v="urn:schemas-microsoft-com:vml" xmlns:wp14="http://schemas.microsoft.com/office/word/2010/wordprocessingDrawing" xmlns:wp="http://schemas.openxmlformats.org/drawingml/2006/wordprocessingDrawing" xmlns:w10="urn:schemas-microsoft-com:office:word" xmlns:w="http://schemas.openxmlformats.org/wordprocessingml/2006/main" xmlns:w14="http://schemas.microsoft.com/office/word/2010/wordml" xmlns:w15="http://schemas.microsoft.com/office/word/2012/wordml" xmlns:w16cex="http://schemas.microsoft.com/office/word/2018/wordml/cex" xmlns:w16cid="http://schemas.microsoft.com/office/word/2016/wordml/cid" xmlns:w16="http://schemas.microsoft.com/office/word/2018/wordml" xmlns:w16du="http://schemas.microsoft.com/office/word/2023/wordml/word16du" xmlns:w16sdtdh="http://schemas.microsoft.com/office/word/2020/wordml/sdtdatahash" xmlns:w16sdtfl="http://schemas.microsoft.com/office/word/2024/wordml/sdtformatlock" xmlns:w16se="http://schemas.microsoft.com/office/word/2015/wordml/symex" xmlns:wpg="http://schemas.microsoft.com/office/word/2010/wordprocessingGroup" xmlns:wpi="http://schemas.microsoft.com/office/word/2010/wordprocessingInk" xmlns:wne="http://schemas.microsoft.com/office/word/2006/wordml" xmlns:wps="http://schemas.microsoft.com/office/word/2010/wordprocessingShape" mc:Ignorable="w14 w15 w16se w16cid w16 w16cex w16sdtdh w16sdtfl w16du wp14">
+  <w:footnote w:type="separator" w:id="-1">
+    <w:p>
+      <w:pPr>
+        <w:spacing w:after="0" w:line="240" w:lineRule="auto"/>
+      </w:pPr>
+      <w:r>
+        <w:separator/>
+      </w:r>
+    </w:p>
+  </w:footnote>
+  <w:footnote w:type="continuationSeparator" w:id="0">
+    <w:p>
+      <w:pPr>
+        <w:spacing w:after="0" w:line="240" w:lineRule="auto"/>
+      </w:pPr>
+      <w:r>
+        <w:continuationSeparator/>
+      </w:r>
+    </w:p>
+  </w:footnote>
+</w:footnotes>
 </file>
 
 <file path=word/numbering.xml><?xml version="1.0" encoding="utf-8"?>
@@ -212,7 +649,7 @@
         <w:rFonts w:ascii="Wingdings" w:hAnsi="Wingdings" w:hint="default"/>
       </w:rPr>
     </w:lvl>
-    <w:lvl w:ilvl="3" w:tplc="04090001" w:tentative="1">
+    <w:lvl w:ilvl="3" w:tplc="04090001">
       <w:start w:val="1"/>
       <w:numFmt w:val="bullet"/>
       <w:lvlText w:val=""/>
@@ -224,7 +661,7 @@
         <w:rFonts w:ascii="Symbol" w:hAnsi="Symbol" w:hint="default"/>
       </w:rPr>
     </w:lvl>
-    <w:lvl w:ilvl="4" w:tplc="04090003" w:tentative="1">
+    <w:lvl w:ilvl="4" w:tplc="04090003">
       <w:start w:val="1"/>
       <w:numFmt w:val="bullet"/>
       <w:lvlText w:val="o"/>
@@ -1231,6 +1668,62 @@
       <w:shd w:val="clear" w:color="auto" w:fill="E1DFDD"/>
     </w:rPr>
   </w:style>
+  <w:style w:type="paragraph" w:styleId="Header">
+    <w:name w:val="header"/>
+    <w:basedOn w:val="Normal"/>
+    <w:link w:val="HeaderChar"/>
+    <w:uiPriority w:val="99"/>
+    <w:unhideWhenUsed/>
+    <w:rsid w:val="003426F1"/>
+    <w:pPr>
+      <w:tabs>
+        <w:tab w:val="center" w:pos="4680"/>
+        <w:tab w:val="right" w:pos="9360"/>
+      </w:tabs>
+      <w:spacing w:after="0" w:line="240" w:lineRule="auto"/>
+    </w:pPr>
+  </w:style>
+  <w:style w:type="character" w:customStyle="1" w:styleId="HeaderChar">
+    <w:name w:val="Header Char"/>
+    <w:basedOn w:val="DefaultParagraphFont"/>
+    <w:link w:val="Header"/>
+    <w:uiPriority w:val="99"/>
+    <w:rsid w:val="003426F1"/>
+  </w:style>
+  <w:style w:type="paragraph" w:styleId="Footer">
+    <w:name w:val="footer"/>
+    <w:basedOn w:val="Normal"/>
+    <w:link w:val="FooterChar"/>
+    <w:uiPriority w:val="99"/>
+    <w:unhideWhenUsed/>
+    <w:rsid w:val="003426F1"/>
+    <w:pPr>
+      <w:tabs>
+        <w:tab w:val="center" w:pos="4680"/>
+        <w:tab w:val="right" w:pos="9360"/>
+      </w:tabs>
+      <w:spacing w:after="0" w:line="240" w:lineRule="auto"/>
+    </w:pPr>
+  </w:style>
+  <w:style w:type="character" w:customStyle="1" w:styleId="FooterChar">
+    <w:name w:val="Footer Char"/>
+    <w:basedOn w:val="DefaultParagraphFont"/>
+    <w:link w:val="Footer"/>
+    <w:uiPriority w:val="99"/>
+    <w:rsid w:val="003426F1"/>
+  </w:style>
+  <w:style w:type="character" w:styleId="FollowedHyperlink">
+    <w:name w:val="FollowedHyperlink"/>
+    <w:basedOn w:val="DefaultParagraphFont"/>
+    <w:uiPriority w:val="99"/>
+    <w:semiHidden/>
+    <w:unhideWhenUsed/>
+    <w:rsid w:val="003426F1"/>
+    <w:rPr>
+      <w:color w:val="96607D" w:themeColor="followedHyperlink"/>
+      <w:u w:val="single"/>
+    </w:rPr>
+  </w:style>
 </w:styles>
 </file>
 

</xml_diff>